<commit_message>
Checkpoint 06:18_19/06/26 saved at 2026-06-19_06-18-40
</commit_message>
<xml_diff>
--- a/backend/templates/QUOTATION/template.docx
+++ b/backend/templates/QUOTATION/template.docx
@@ -10,13 +10,12 @@
         <w:tblLook w:val="0620" w:firstRow="1" w:lastRow="0" w:firstColumn="0" w:lastColumn="0" w:noHBand="1" w:noVBand="1"/>
       </w:tblPr>
       <w:tblGrid>
-        <w:gridCol w:w="1452"/>
-        <w:gridCol w:w="1641"/>
-        <w:gridCol w:w="261"/>
-        <w:gridCol w:w="2293"/>
-        <w:gridCol w:w="1449"/>
-        <w:gridCol w:w="2023"/>
-        <w:gridCol w:w="2203"/>
+        <w:gridCol w:w="1445"/>
+        <w:gridCol w:w="1633"/>
+        <w:gridCol w:w="2282"/>
+        <w:gridCol w:w="1442"/>
+        <w:gridCol w:w="2014"/>
+        <w:gridCol w:w="2506"/>
       </w:tblGrid>
       <w:tr>
         <w:trPr>
@@ -73,25 +72,6 @@
               </w:rPr>
               <w:t>Plan Code</w:t>
             </w:r>
-          </w:p>
-        </w:tc>
-        <w:tc>
-          <w:tcPr>
-            <w:tcW w:w="0" w:type="auto"/>
-            <w:tcBorders>
-              <w:top w:val="single" w:sz="12" w:space="0" w:color="auto"/>
-              <w:left w:val="single" w:sz="4" w:space="0" w:color="auto"/>
-              <w:bottom w:val="single" w:sz="4" w:space="0" w:color="auto"/>
-              <w:right w:val="single" w:sz="4" w:space="0" w:color="auto"/>
-            </w:tcBorders>
-          </w:tcPr>
-          <w:p>
-            <w:pPr>
-              <w:rPr>
-                <w:rFonts w:ascii="TT Norms Regular" w:hAnsi="TT Norms Regular"/>
-                <w:szCs w:val="20"/>
-              </w:rPr>
-            </w:pPr>
           </w:p>
         </w:tc>
         <w:tc>
@@ -308,25 +288,6 @@
               </w:rPr>
               <w:t>}}</w:t>
             </w:r>
-          </w:p>
-        </w:tc>
-        <w:tc>
-          <w:tcPr>
-            <w:tcW w:w="0" w:type="auto"/>
-            <w:tcBorders>
-              <w:top w:val="single" w:sz="4" w:space="0" w:color="auto"/>
-              <w:left w:val="single" w:sz="4" w:space="0" w:color="auto"/>
-              <w:bottom w:val="single" w:sz="4" w:space="0" w:color="auto"/>
-              <w:right w:val="single" w:sz="4" w:space="0" w:color="auto"/>
-            </w:tcBorders>
-          </w:tcPr>
-          <w:p>
-            <w:pPr>
-              <w:rPr>
-                <w:rFonts w:ascii="TT Norms Regular" w:hAnsi="TT Norms Regular"/>
-                <w:szCs w:val="20"/>
-              </w:rPr>
-            </w:pPr>
           </w:p>
         </w:tc>
         <w:tc>
@@ -610,25 +571,6 @@
               <w:top w:val="single" w:sz="4" w:space="0" w:color="auto"/>
               <w:left w:val="single" w:sz="4" w:space="0" w:color="auto"/>
               <w:bottom w:val="single" w:sz="12" w:space="0" w:color="auto"/>
-              <w:right w:val="single" w:sz="4" w:space="0" w:color="auto"/>
-            </w:tcBorders>
-          </w:tcPr>
-          <w:p>
-            <w:pPr>
-              <w:rPr>
-                <w:rFonts w:ascii="TT Norms Regular" w:hAnsi="TT Norms Regular"/>
-                <w:szCs w:val="20"/>
-              </w:rPr>
-            </w:pPr>
-          </w:p>
-        </w:tc>
-        <w:tc>
-          <w:tcPr>
-            <w:tcW w:w="0" w:type="auto"/>
-            <w:tcBorders>
-              <w:top w:val="single" w:sz="4" w:space="0" w:color="auto"/>
-              <w:left w:val="single" w:sz="4" w:space="0" w:color="auto"/>
-              <w:bottom w:val="single" w:sz="12" w:space="0" w:color="auto"/>
               <w:right w:val="single" w:sz="12" w:space="0" w:color="auto"/>
             </w:tcBorders>
           </w:tcPr>
@@ -648,7 +590,7 @@
         </w:trPr>
         <w:tc>
           <w:tcPr>
-            <w:tcW w:w="0" w:type="auto"/>
+            <w:tcW w:w="8816" w:type="dxa"/>
             <w:gridSpan w:val="5"/>
             <w:tcBorders>
               <w:top w:val="single" w:sz="12" w:space="0" w:color="auto"/>
@@ -676,8 +618,7 @@
         </w:tc>
         <w:tc>
           <w:tcPr>
-            <w:tcW w:w="0" w:type="auto"/>
-            <w:gridSpan w:val="2"/>
+            <w:tcW w:w="2506" w:type="dxa"/>
             <w:tcBorders>
               <w:top w:val="single" w:sz="12" w:space="0" w:color="auto"/>
               <w:left w:val="single" w:sz="4" w:space="0" w:color="auto"/>
@@ -708,7 +649,7 @@
         </w:trPr>
         <w:tc>
           <w:tcPr>
-            <w:tcW w:w="0" w:type="auto"/>
+            <w:tcW w:w="8816" w:type="dxa"/>
             <w:gridSpan w:val="5"/>
             <w:tcBorders>
               <w:top w:val="single" w:sz="4" w:space="0" w:color="auto"/>
@@ -730,21 +671,13 @@
                 <w:rFonts w:ascii="TT Norms Regular" w:hAnsi="TT Norms Regular"/>
                 <w:szCs w:val="20"/>
               </w:rPr>
-              <w:t>DISCOUNT</w:t>
-            </w:r>
-            <w:r>
-              <w:rPr>
-                <w:rFonts w:ascii="TT Norms Regular" w:hAnsi="TT Norms Regular"/>
-                <w:szCs w:val="20"/>
-              </w:rPr>
-              <w:t>:</w:t>
+              <w:t>DISCOUNT:</w:t>
             </w:r>
           </w:p>
         </w:tc>
         <w:tc>
           <w:tcPr>
-            <w:tcW w:w="0" w:type="auto"/>
-            <w:gridSpan w:val="2"/>
+            <w:tcW w:w="2506" w:type="dxa"/>
             <w:tcBorders>
               <w:top w:val="single" w:sz="4" w:space="0" w:color="auto"/>
               <w:left w:val="single" w:sz="4" w:space="0" w:color="auto"/>
@@ -774,7 +707,7 @@
         </w:trPr>
         <w:tc>
           <w:tcPr>
-            <w:tcW w:w="0" w:type="auto"/>
+            <w:tcW w:w="8816" w:type="dxa"/>
             <w:gridSpan w:val="5"/>
             <w:tcBorders>
               <w:top w:val="single" w:sz="4" w:space="0" w:color="auto"/>
@@ -802,8 +735,7 @@
         </w:tc>
         <w:tc>
           <w:tcPr>
-            <w:tcW w:w="0" w:type="auto"/>
-            <w:gridSpan w:val="2"/>
+            <w:tcW w:w="2506" w:type="dxa"/>
             <w:tcBorders>
               <w:top w:val="single" w:sz="4" w:space="0" w:color="auto"/>
               <w:left w:val="single" w:sz="4" w:space="0" w:color="auto"/>
@@ -834,7 +766,7 @@
         </w:trPr>
         <w:tc>
           <w:tcPr>
-            <w:tcW w:w="0" w:type="auto"/>
+            <w:tcW w:w="8816" w:type="dxa"/>
             <w:gridSpan w:val="5"/>
             <w:tcBorders>
               <w:top w:val="single" w:sz="4" w:space="0" w:color="auto"/>
@@ -875,8 +807,7 @@
         </w:tc>
         <w:tc>
           <w:tcPr>
-            <w:tcW w:w="0" w:type="auto"/>
-            <w:gridSpan w:val="2"/>
+            <w:tcW w:w="2506" w:type="dxa"/>
             <w:tcBorders>
               <w:top w:val="single" w:sz="4" w:space="0" w:color="auto"/>
               <w:left w:val="single" w:sz="4" w:space="0" w:color="auto"/>
@@ -907,7 +838,7 @@
         </w:trPr>
         <w:tc>
           <w:tcPr>
-            <w:tcW w:w="0" w:type="auto"/>
+            <w:tcW w:w="8816" w:type="dxa"/>
             <w:gridSpan w:val="5"/>
             <w:tcBorders>
               <w:top w:val="single" w:sz="12" w:space="0" w:color="auto"/>
@@ -950,8 +881,7 @@
         </w:tc>
         <w:tc>
           <w:tcPr>
-            <w:tcW w:w="0" w:type="auto"/>
-            <w:gridSpan w:val="2"/>
+            <w:tcW w:w="2506" w:type="dxa"/>
             <w:tcBorders>
               <w:top w:val="single" w:sz="12" w:space="0" w:color="auto"/>
               <w:left w:val="single" w:sz="4" w:space="0" w:color="auto"/>
@@ -971,21 +901,7 @@
                 <w:rFonts w:ascii="TT Norms Regular" w:hAnsi="TT Norms Regular"/>
                 <w:szCs w:val="20"/>
               </w:rPr>
-              <w:t>{{</w:t>
-            </w:r>
-            <w:r>
-              <w:rPr>
-                <w:rFonts w:ascii="TT Norms Regular" w:hAnsi="TT Norms Regular"/>
-                <w:szCs w:val="20"/>
-              </w:rPr>
-              <w:t>DEPOSIT</w:t>
-            </w:r>
-            <w:r>
-              <w:rPr>
-                <w:rFonts w:ascii="TT Norms Regular" w:hAnsi="TT Norms Regular"/>
-                <w:szCs w:val="20"/>
-              </w:rPr>
-              <w:t>}}</w:t>
+              <w:t>{{DEPOSIT}}</w:t>
             </w:r>
           </w:p>
         </w:tc>
@@ -1004,12 +920,8 @@
       </w:pPr>
     </w:p>
     <w:sectPr>
-      <w:headerReference w:type="even" r:id="rId8"/>
-      <w:headerReference w:type="default" r:id="rId9"/>
-      <w:footerReference w:type="even" r:id="rId10"/>
-      <w:footerReference w:type="default" r:id="rId11"/>
-      <w:headerReference w:type="first" r:id="rId12"/>
-      <w:footerReference w:type="first" r:id="rId13"/>
+      <w:headerReference w:type="default" r:id="rId8"/>
+      <w:footerReference w:type="default" r:id="rId9"/>
       <w:pgSz w:w="12240" w:h="15840"/>
       <w:pgMar w:top="851" w:right="567" w:bottom="851" w:left="567" w:header="720" w:footer="720" w:gutter="0"/>
       <w:cols w:space="720"/>
@@ -1049,16 +961,6 @@
   <w:p>
     <w:pPr>
       <w:pStyle w:val="Footer"/>
-    </w:pPr>
-  </w:p>
-</w:ftr>
-</file>
-
-<file path=word/footer2.xml><?xml version="1.0" encoding="utf-8"?>
-<w:ftr xmlns:wpc="http://schemas.microsoft.com/office/word/2010/wordprocessingCanvas" xmlns:cx="http://schemas.microsoft.com/office/drawing/2014/chartex" xmlns:cx1="http://schemas.microsoft.com/office/drawing/2015/9/8/chartex" xmlns:cx2="http://schemas.microsoft.com/office/drawing/2015/10/21/chartex" xmlns:cx3="http://schemas.microsoft.com/office/drawing/2016/5/9/chartex" xmlns:cx4="http://schemas.microsoft.com/office/drawing/2016/5/10/chartex" xmlns:cx5="http://schemas.microsoft.com/office/drawing/2016/5/11/chartex" xmlns:cx6="http://schemas.microsoft.com/office/drawing/2016/5/12/chartex" xmlns:cx7="http://schemas.microsoft.com/office/drawing/2016/5/13/chartex" xmlns:cx8="http://schemas.microsoft.com/office/drawing/2016/5/14/chartex" xmlns:mc="http://schemas.openxmlformats.org/markup-compatibility/2006" xmlns:aink="http://schemas.microsoft.com/office/drawing/2016/ink" xmlns:am3d="http://schemas.microsoft.com/office/drawing/2017/model3d" xmlns:o="urn:schemas-microsoft-com:office:office" xmlns:oel="http://schemas.microsoft.com/office/2019/extlst" xmlns:r="http://schemas.openxmlformats.org/officeDocument/2006/relationships" xmlns:m="http://schemas.openxmlformats.org/officeDocument/2006/math" xmlns:v="urn:schemas-microsoft-com:vml" xmlns:wp14="http://schemas.microsoft.com/office/word/2010/wordprocessingDrawing" xmlns:wp="http://schemas.openxmlformats.org/drawingml/2006/wordprocessingDrawing" xmlns:w10="urn:schemas-microsoft-com:office:word" xmlns:w="http://schemas.openxmlformats.org/wordprocessingml/2006/main" xmlns:w14="http://schemas.microsoft.com/office/word/2010/wordml" xmlns:w15="http://schemas.microsoft.com/office/word/2012/wordml" xmlns:w16cex="http://schemas.microsoft.com/office/word/2018/wordml/cex" xmlns:w16cid="http://schemas.microsoft.com/office/word/2016/wordml/cid" xmlns:w16="http://schemas.microsoft.com/office/word/2018/wordml" xmlns:w16du="http://schemas.microsoft.com/office/word/2023/wordml/word16du" xmlns:w16sdtdh="http://schemas.microsoft.com/office/word/2020/wordml/sdtdatahash" xmlns:w16sdtfl="http://schemas.microsoft.com/office/word/2024/wordml/sdtformatlock" xmlns:w16se="http://schemas.microsoft.com/office/word/2015/wordml/symex" xmlns:wpg="http://schemas.microsoft.com/office/word/2010/wordprocessingGroup" xmlns:wpi="http://schemas.microsoft.com/office/word/2010/wordprocessingInk" xmlns:wne="http://schemas.microsoft.com/office/word/2006/wordml" xmlns:wps="http://schemas.microsoft.com/office/word/2010/wordprocessingShape" mc:Ignorable="w14 w15 w16se w16cid w16 w16cex w16sdtdh w16sdtfl w16du wp14">
-  <w:p>
-    <w:pPr>
-      <w:pStyle w:val="Footer"/>
       <w:rPr>
         <w:rFonts w:ascii="TT Norms Regular" w:hAnsi="TT Norms Regular"/>
         <w:color w:val="EE0000"/>
@@ -1263,16 +1165,6 @@
       </w:rPr>
       <w:t>VAT No: 4590312965 - Reg No. 2022/863083/07 - Tell No. 087 711 0660</w:t>
     </w:r>
-  </w:p>
-</w:ftr>
-</file>
-
-<file path=word/footer3.xml><?xml version="1.0" encoding="utf-8"?>
-<w:ftr xmlns:wpc="http://schemas.microsoft.com/office/word/2010/wordprocessingCanvas" xmlns:cx="http://schemas.microsoft.com/office/drawing/2014/chartex" xmlns:cx1="http://schemas.microsoft.com/office/drawing/2015/9/8/chartex" xmlns:cx2="http://schemas.microsoft.com/office/drawing/2015/10/21/chartex" xmlns:cx3="http://schemas.microsoft.com/office/drawing/2016/5/9/chartex" xmlns:cx4="http://schemas.microsoft.com/office/drawing/2016/5/10/chartex" xmlns:cx5="http://schemas.microsoft.com/office/drawing/2016/5/11/chartex" xmlns:cx6="http://schemas.microsoft.com/office/drawing/2016/5/12/chartex" xmlns:cx7="http://schemas.microsoft.com/office/drawing/2016/5/13/chartex" xmlns:cx8="http://schemas.microsoft.com/office/drawing/2016/5/14/chartex" xmlns:mc="http://schemas.openxmlformats.org/markup-compatibility/2006" xmlns:aink="http://schemas.microsoft.com/office/drawing/2016/ink" xmlns:am3d="http://schemas.microsoft.com/office/drawing/2017/model3d" xmlns:o="urn:schemas-microsoft-com:office:office" xmlns:oel="http://schemas.microsoft.com/office/2019/extlst" xmlns:r="http://schemas.openxmlformats.org/officeDocument/2006/relationships" xmlns:m="http://schemas.openxmlformats.org/officeDocument/2006/math" xmlns:v="urn:schemas-microsoft-com:vml" xmlns:wp14="http://schemas.microsoft.com/office/word/2010/wordprocessingDrawing" xmlns:wp="http://schemas.openxmlformats.org/drawingml/2006/wordprocessingDrawing" xmlns:w10="urn:schemas-microsoft-com:office:word" xmlns:w="http://schemas.openxmlformats.org/wordprocessingml/2006/main" xmlns:w14="http://schemas.microsoft.com/office/word/2010/wordml" xmlns:w15="http://schemas.microsoft.com/office/word/2012/wordml" xmlns:w16cex="http://schemas.microsoft.com/office/word/2018/wordml/cex" xmlns:w16cid="http://schemas.microsoft.com/office/word/2016/wordml/cid" xmlns:w16="http://schemas.microsoft.com/office/word/2018/wordml" xmlns:w16du="http://schemas.microsoft.com/office/word/2023/wordml/word16du" xmlns:w16sdtdh="http://schemas.microsoft.com/office/word/2020/wordml/sdtdatahash" xmlns:w16sdtfl="http://schemas.microsoft.com/office/word/2024/wordml/sdtformatlock" xmlns:w16se="http://schemas.microsoft.com/office/word/2015/wordml/symex" xmlns:wpg="http://schemas.microsoft.com/office/word/2010/wordprocessingGroup" xmlns:wpi="http://schemas.microsoft.com/office/word/2010/wordprocessingInk" xmlns:wne="http://schemas.microsoft.com/office/word/2006/wordml" xmlns:wps="http://schemas.microsoft.com/office/word/2010/wordprocessingShape" mc:Ignorable="w14 w15 w16se w16cid w16 w16cex w16sdtdh w16sdtfl w16du wp14">
-  <w:p>
-    <w:pPr>
-      <w:pStyle w:val="Footer"/>
-    </w:pPr>
   </w:p>
 </w:ftr>
 </file>
@@ -1307,16 +1199,6 @@
   <w:p>
     <w:pPr>
       <w:pStyle w:val="Header"/>
-    </w:pPr>
-  </w:p>
-</w:hdr>
-</file>
-
-<file path=word/header2.xml><?xml version="1.0" encoding="utf-8"?>
-<w:hdr xmlns:wpc="http://schemas.microsoft.com/office/word/2010/wordprocessingCanvas" xmlns:cx="http://schemas.microsoft.com/office/drawing/2014/chartex" xmlns:cx1="http://schemas.microsoft.com/office/drawing/2015/9/8/chartex" xmlns:cx2="http://schemas.microsoft.com/office/drawing/2015/10/21/chartex" xmlns:cx3="http://schemas.microsoft.com/office/drawing/2016/5/9/chartex" xmlns:cx4="http://schemas.microsoft.com/office/drawing/2016/5/10/chartex" xmlns:cx5="http://schemas.microsoft.com/office/drawing/2016/5/11/chartex" xmlns:cx6="http://schemas.microsoft.com/office/drawing/2016/5/12/chartex" xmlns:cx7="http://schemas.microsoft.com/office/drawing/2016/5/13/chartex" xmlns:cx8="http://schemas.microsoft.com/office/drawing/2016/5/14/chartex" xmlns:mc="http://schemas.openxmlformats.org/markup-compatibility/2006" xmlns:aink="http://schemas.microsoft.com/office/drawing/2016/ink" xmlns:am3d="http://schemas.microsoft.com/office/drawing/2017/model3d" xmlns:o="urn:schemas-microsoft-com:office:office" xmlns:oel="http://schemas.microsoft.com/office/2019/extlst" xmlns:r="http://schemas.openxmlformats.org/officeDocument/2006/relationships" xmlns:m="http://schemas.openxmlformats.org/officeDocument/2006/math" xmlns:v="urn:schemas-microsoft-com:vml" xmlns:wp14="http://schemas.microsoft.com/office/word/2010/wordprocessingDrawing" xmlns:wp="http://schemas.openxmlformats.org/drawingml/2006/wordprocessingDrawing" xmlns:w10="urn:schemas-microsoft-com:office:word" xmlns:w="http://schemas.openxmlformats.org/wordprocessingml/2006/main" xmlns:w14="http://schemas.microsoft.com/office/word/2010/wordml" xmlns:w15="http://schemas.microsoft.com/office/word/2012/wordml" xmlns:w16cex="http://schemas.microsoft.com/office/word/2018/wordml/cex" xmlns:w16cid="http://schemas.microsoft.com/office/word/2016/wordml/cid" xmlns:w16="http://schemas.microsoft.com/office/word/2018/wordml" xmlns:w16du="http://schemas.microsoft.com/office/word/2023/wordml/word16du" xmlns:w16sdtdh="http://schemas.microsoft.com/office/word/2020/wordml/sdtdatahash" xmlns:w16sdtfl="http://schemas.microsoft.com/office/word/2024/wordml/sdtformatlock" xmlns:w16se="http://schemas.microsoft.com/office/word/2015/wordml/symex" xmlns:wpg="http://schemas.microsoft.com/office/word/2010/wordprocessingGroup" xmlns:wpi="http://schemas.microsoft.com/office/word/2010/wordprocessingInk" xmlns:wne="http://schemas.microsoft.com/office/word/2006/wordml" xmlns:wps="http://schemas.microsoft.com/office/word/2010/wordprocessingShape" mc:Ignorable="w14 w15 w16se w16cid w16 w16cex w16sdtdh w16sdtfl w16du wp14">
-  <w:p>
-    <w:pPr>
-      <w:pStyle w:val="Header"/>
       <w:jc w:val="both"/>
       <w:rPr>
         <w:rFonts w:ascii="TT Norms Regular" w:hAnsi="TT Norms Regular"/>
@@ -1336,7 +1218,7 @@
         <w:szCs w:val="48"/>
       </w:rPr>
       <w:drawing>
-        <wp:anchor distT="0" distB="0" distL="114300" distR="114300" simplePos="0" relativeHeight="251659264" behindDoc="0" locked="0" layoutInCell="1" allowOverlap="1" wp14:anchorId="35AB9C5B" wp14:editId="1322E7BA">
+        <wp:anchor distT="0" distB="0" distL="114300" distR="114300" simplePos="0" relativeHeight="251657728" behindDoc="0" locked="0" layoutInCell="1" allowOverlap="1" wp14:anchorId="35AB9C5B" wp14:editId="1322E7BA">
           <wp:simplePos x="0" y="0"/>
           <wp:positionH relativeFrom="column">
             <wp:posOffset>5737860</wp:posOffset>
@@ -1497,7 +1379,7 @@
         </mc:Choice>
         <mc:Fallback>
           <w:pict>
-            <v:line w14:anchorId="13C7BDCA" id="Straight Connector 2" o:spid="_x0000_s1026" style="flip:x;visibility:visible;mso-wrap-style:square;mso-left-percent:-10001;mso-top-percent:-10001;mso-position-horizontal:absolute;mso-position-horizontal-relative:char;mso-position-vertical:absolute;mso-position-vertical-relative:line;mso-left-percent:-10001;mso-top-percent:-10001" from="0,0" to="541.5pt,0" o:gfxdata="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" strokecolor="black [3200]" strokeweight="2pt">
+            <v:line w14:anchorId="4A578873" id="Straight Connector 2" o:spid="_x0000_s1026" style="flip:x;visibility:visible;mso-wrap-style:square;mso-left-percent:-10001;mso-top-percent:-10001;mso-position-horizontal:absolute;mso-position-horizontal-relative:char;mso-position-vertical:absolute;mso-position-vertical-relative:line;mso-left-percent:-10001;mso-top-percent:-10001" from="0,0" to="541.5pt,0" o:gfxdata="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" strokecolor="black [3200]" strokeweight="2pt">
               <v:shadow on="t" color="black" opacity="24903f" origin=",.5" offset="0,.55556mm"/>
               <w10:anchorlock/>
             </v:line>
@@ -1505,16 +1387,6 @@
         </mc:Fallback>
       </mc:AlternateContent>
     </w:r>
-  </w:p>
-</w:hdr>
-</file>
-
-<file path=word/header3.xml><?xml version="1.0" encoding="utf-8"?>
-<w:hdr xmlns:wpc="http://schemas.microsoft.com/office/word/2010/wordprocessingCanvas" xmlns:cx="http://schemas.microsoft.com/office/drawing/2014/chartex" xmlns:cx1="http://schemas.microsoft.com/office/drawing/2015/9/8/chartex" xmlns:cx2="http://schemas.microsoft.com/office/drawing/2015/10/21/chartex" xmlns:cx3="http://schemas.microsoft.com/office/drawing/2016/5/9/chartex" xmlns:cx4="http://schemas.microsoft.com/office/drawing/2016/5/10/chartex" xmlns:cx5="http://schemas.microsoft.com/office/drawing/2016/5/11/chartex" xmlns:cx6="http://schemas.microsoft.com/office/drawing/2016/5/12/chartex" xmlns:cx7="http://schemas.microsoft.com/office/drawing/2016/5/13/chartex" xmlns:cx8="http://schemas.microsoft.com/office/drawing/2016/5/14/chartex" xmlns:mc="http://schemas.openxmlformats.org/markup-compatibility/2006" xmlns:aink="http://schemas.microsoft.com/office/drawing/2016/ink" xmlns:am3d="http://schemas.microsoft.com/office/drawing/2017/model3d" xmlns:o="urn:schemas-microsoft-com:office:office" xmlns:oel="http://schemas.microsoft.com/office/2019/extlst" xmlns:r="http://schemas.openxmlformats.org/officeDocument/2006/relationships" xmlns:m="http://schemas.openxmlformats.org/officeDocument/2006/math" xmlns:v="urn:schemas-microsoft-com:vml" xmlns:wp14="http://schemas.microsoft.com/office/word/2010/wordprocessingDrawing" xmlns:wp="http://schemas.openxmlformats.org/drawingml/2006/wordprocessingDrawing" xmlns:w10="urn:schemas-microsoft-com:office:word" xmlns:w="http://schemas.openxmlformats.org/wordprocessingml/2006/main" xmlns:w14="http://schemas.microsoft.com/office/word/2010/wordml" xmlns:w15="http://schemas.microsoft.com/office/word/2012/wordml" xmlns:w16cex="http://schemas.microsoft.com/office/word/2018/wordml/cex" xmlns:w16cid="http://schemas.microsoft.com/office/word/2016/wordml/cid" xmlns:w16="http://schemas.microsoft.com/office/word/2018/wordml" xmlns:w16du="http://schemas.microsoft.com/office/word/2023/wordml/word16du" xmlns:w16sdtdh="http://schemas.microsoft.com/office/word/2020/wordml/sdtdatahash" xmlns:w16sdtfl="http://schemas.microsoft.com/office/word/2024/wordml/sdtformatlock" xmlns:w16se="http://schemas.microsoft.com/office/word/2015/wordml/symex" xmlns:wpg="http://schemas.microsoft.com/office/word/2010/wordprocessingGroup" xmlns:wpi="http://schemas.microsoft.com/office/word/2010/wordprocessingInk" xmlns:wne="http://schemas.microsoft.com/office/word/2006/wordml" xmlns:wps="http://schemas.microsoft.com/office/word/2010/wordprocessingShape" mc:Ignorable="w14 w15 w16se w16cid w16 w16cex w16sdtdh w16sdtfl w16du wp14">
-  <w:p>
-    <w:pPr>
-      <w:pStyle w:val="Header"/>
-    </w:pPr>
   </w:p>
 </w:hdr>
 </file>
@@ -2327,6 +2199,7 @@
   <w:style w:type="character" w:default="1" w:styleId="DefaultParagraphFont">
     <w:name w:val="Default Paragraph Font"/>
     <w:uiPriority w:val="1"/>
+    <w:semiHidden/>
     <w:unhideWhenUsed/>
   </w:style>
   <w:style w:type="table" w:default="1" w:styleId="TableNormal">

</xml_diff>